<commit_message>
feat: Add native OMML math equation panel with one-click copy, kid-friendly courtroom titles, and neutral competence framing
</commit_message>
<xml_diff>
--- a/工作紙_按週分冊/第01週_果汁濃度與比值的本質_課堂探究單.docx
+++ b/工作紙_按週分冊/第01週_果汁濃度與比值的本質_課堂探究單.docx
@@ -69,7 +69,7 @@
                 <w:sz w:val="16"/>
                 <w:rFonts w:ascii="微軟正黑體" w:hAnsi="微軟正黑體" w:eastAsia="微軟正黑體"/>
               </w:rPr>
-              <w:t>【PISA素養】數量 (Quantity) | 6上 課次1: 生活中的比 (一)</w:t>
+              <w:t>【思維範疇】數量 (Quantity) | 6上 課次1: 生活中的比 (一)</w:t>
             </w:r>
           </w:p>
         </w:tc>
@@ -177,7 +177,7 @@
                 <w:sz w:val="20"/>
                 <w:rFonts w:ascii="微軟正黑體" w:hAnsi="微軟正黑體" w:eastAsia="微軟正黑體"/>
               </w:rPr>
-              <w:t>一、 PISA 2029 素養情境導引與文本審查</w:t>
+              <w:t>一、 生活真實情境導引與資訊審查</w:t>
             </w:r>
           </w:p>
           <w:p>
@@ -262,7 +262,7 @@
                 <w:sz w:val="20"/>
                 <w:rFonts w:ascii="微軟正黑體" w:hAnsi="微軟正黑體" w:eastAsia="微軟正黑體"/>
               </w:rPr>
-              <w:t>二、 課堂動態實驗操作：果汁調配動態模擬與比值濃度實驗台</w:t>
+              <w:t>二、 課堂動態實驗操作與數據記錄：果汁調配動態模擬與比值濃度實驗台</w:t>
             </w:r>
           </w:p>
           <w:p>
@@ -1297,7 +1297,7 @@
           <w:sz w:val="20"/>
           <w:rFonts w:ascii="微軟正黑體" w:hAnsi="微軟正黑體" w:eastAsia="微軟正黑體"/>
         </w:rPr>
-        <w:t>三、 CER 學術論證實踐（主張 - 證據 - 推理 - 反駁）</w:t>
+        <w:t>三、 數學小法庭：思維論證四步走（亮主張 · 擺證據 · 說道理 · 破迷思）</w:t>
       </w:r>
     </w:p>
     <w:tbl>
@@ -1322,7 +1322,7 @@
       <w:tr>
         <w:tc>
           <w:tcPr>
-            <w:tcW w:type="dxa" w:w="1928"/>
+            <w:tcW w:type="dxa" w:w="2041"/>
             <w:shd w:fill="F7FAFC"/>
             <w:tcMar>
               <w:top w:w="40" w:type="dxa"/>
@@ -1345,15 +1345,15 @@
                 <w:sz w:val="16"/>
                 <w:rFonts w:ascii="微軟正黑體" w:hAnsi="微軟正黑體" w:eastAsia="微軟正黑體"/>
               </w:rPr>
-              <w:t>🟢 主張 (Claim)</w:t>
+              <w:t>🟢 我的主張 (Claim)</w:t>
               <w:br/>
-              <w:t>明確立場結論</w:t>
+              <w:t>明確結論與立場</w:t>
             </w:r>
           </w:p>
         </w:tc>
         <w:tc>
           <w:tcPr>
-            <w:tcW w:type="dxa" w:w="8164"/>
+            <w:tcW w:type="dxa" w:w="8050"/>
             <w:shd w:fill="FFFFFF"/>
             <w:tcMar>
               <w:top w:w="40" w:type="dxa"/>
@@ -1375,7 +1375,7 @@
                 <w:sz w:val="16"/>
                 <w:rFonts w:ascii="微軟正黑體" w:hAnsi="微軟正黑體" w:eastAsia="微軟正黑體"/>
               </w:rPr>
-              <w:t>我的明確結論是：</w:t>
+              <w:t>【亮出我的觀點】我的明確結論是：</w:t>
             </w:r>
           </w:p>
           <w:p>
@@ -1415,7 +1415,7 @@
       <w:tr>
         <w:tc>
           <w:tcPr>
-            <w:tcW w:type="dxa" w:w="1928"/>
+            <w:tcW w:type="dxa" w:w="2041"/>
             <w:shd w:fill="F7FAFC"/>
             <w:tcMar>
               <w:top w:w="40" w:type="dxa"/>
@@ -1438,15 +1438,15 @@
                 <w:sz w:val="16"/>
                 <w:rFonts w:ascii="微軟正黑體" w:hAnsi="微軟正黑體" w:eastAsia="微軟正黑體"/>
               </w:rPr>
-              <w:t>🟡 證據 (Evidence)</w:t>
+              <w:t>🟡 事實證據 (Evidence)</w:t>
               <w:br/>
-              <w:t>數據/算理事實</w:t>
+              <w:t>數據與算理事實</w:t>
             </w:r>
           </w:p>
         </w:tc>
         <w:tc>
           <w:tcPr>
-            <w:tcW w:type="dxa" w:w="8164"/>
+            <w:tcW w:type="dxa" w:w="8050"/>
             <w:shd w:fill="FFFFFF"/>
             <w:tcMar>
               <w:top w:w="40" w:type="dxa"/>
@@ -1468,7 +1468,7 @@
                 <w:sz w:val="16"/>
                 <w:rFonts w:ascii="微軟正黑體" w:hAnsi="微軟正黑體" w:eastAsia="微軟正黑體"/>
               </w:rPr>
-              <w:t>支持我的計算數據與事實是：</w:t>
+              <w:t>【拿出關鍵證據】支持我的數據與計算事實是：</w:t>
             </w:r>
           </w:p>
           <w:p>
@@ -1508,7 +1508,7 @@
       <w:tr>
         <w:tc>
           <w:tcPr>
-            <w:tcW w:type="dxa" w:w="1928"/>
+            <w:tcW w:type="dxa" w:w="2041"/>
             <w:shd w:fill="F7FAFC"/>
             <w:tcMar>
               <w:top w:w="40" w:type="dxa"/>
@@ -1531,15 +1531,15 @@
                 <w:sz w:val="16"/>
                 <w:rFonts w:ascii="微軟正黑體" w:hAnsi="微軟正黑體" w:eastAsia="微軟正黑體"/>
               </w:rPr>
-              <w:t>🔵 推理 (Reasoning)</w:t>
+              <w:t>🔵 數學道理 (Reasoning)</w:t>
               <w:br/>
-              <w:t>底層數理本質</w:t>
+              <w:t>底層數學模型原理</w:t>
             </w:r>
           </w:p>
         </w:tc>
         <w:tc>
           <w:tcPr>
-            <w:tcW w:type="dxa" w:w="8164"/>
+            <w:tcW w:type="dxa" w:w="8050"/>
             <w:shd w:fill="FFFFFF"/>
             <w:tcMar>
               <w:top w:w="40" w:type="dxa"/>
@@ -1561,7 +1561,7 @@
                 <w:sz w:val="16"/>
                 <w:rFonts w:ascii="微軟正黑體" w:hAnsi="微軟正黑體" w:eastAsia="微軟正黑體"/>
               </w:rPr>
-              <w:t>連結證據到主張的數學原理是：</w:t>
+              <w:t>【講清背後道理】把證據連結到觀點的數學原理是：</w:t>
             </w:r>
           </w:p>
           <w:p>
@@ -1601,7 +1601,7 @@
       <w:tr>
         <w:tc>
           <w:tcPr>
-            <w:tcW w:type="dxa" w:w="1928"/>
+            <w:tcW w:type="dxa" w:w="2041"/>
             <w:shd w:fill="F7FAFC"/>
             <w:tcMar>
               <w:top w:w="40" w:type="dxa"/>
@@ -1624,15 +1624,15 @@
                 <w:sz w:val="16"/>
                 <w:rFonts w:ascii="微軟正黑體" w:hAnsi="微軟正黑體" w:eastAsia="微軟正黑體"/>
               </w:rPr>
-              <w:t>🔴 反駁 (Rebuttal)</w:t>
+              <w:t>🔴 擊破迷思 (Rebuttal)</w:t>
               <w:br/>
-              <w:t>直擊直覺迷思</w:t>
+              <w:t>反駁常見直覺盲點</w:t>
             </w:r>
           </w:p>
         </w:tc>
         <w:tc>
           <w:tcPr>
-            <w:tcW w:type="dxa" w:w="8164"/>
+            <w:tcW w:type="dxa" w:w="8050"/>
             <w:shd w:fill="FFFFFF"/>
             <w:tcMar>
               <w:top w:w="40" w:type="dxa"/>
@@ -1654,7 +1654,7 @@
                 <w:sz w:val="16"/>
                 <w:rFonts w:ascii="微軟正黑體" w:hAnsi="微軟正黑體" w:eastAsia="微軟正黑體"/>
               </w:rPr>
-              <w:t>反駁直覺常見誤解：</w:t>
+              <w:t>【反駁直覺盲區】有力駁斥常見的『想當然』錯誤：</w:t>
             </w:r>
           </w:p>
           <w:p>
@@ -1705,7 +1705,7 @@
           <w:sz w:val="19"/>
           <w:rFonts w:ascii="微軟正黑體" w:hAnsi="微軟正黑體" w:eastAsia="微軟正黑體"/>
         </w:rPr>
-        <w:t>四、 PISA 2029 基礎精準練（掌握本質與單位率）</w:t>
+        <w:t>四、 核心思維基礎精準練（掌握本質與單位率）</w:t>
       </w:r>
     </w:p>
     <w:p>
@@ -1789,7 +1789,7 @@
           <w:sz w:val="19"/>
           <w:rFonts w:ascii="微軟正黑體" w:hAnsi="微軟正黑體" w:eastAsia="微軟正黑體"/>
         </w:rPr>
-        <w:t>五、 PISA 2029 拓展突破題（計算思維 / 媒體審查 MAIL / 演算法設計）</w:t>
+        <w:t>五、 前瞻高階思維拓展題（計算思維 / 資訊審查 / 演算法設計）</w:t>
       </w:r>
     </w:p>
     <w:p>
@@ -1805,7 +1805,7 @@
           <w:sz w:val="17"/>
           <w:rFonts w:ascii="微軟正黑體" w:hAnsi="微軟正黑體" w:eastAsia="微軟正黑體"/>
         </w:rPr>
-        <w:t>【PISA 拓展與演算法設計】班級籌備 30 人的聯歡會，需調配『果汁:清水 = 1:4』的混合飲品共 15 公升（15,000 mL）。請設計分步演算法計算：濃縮果汁與清水各需多少毫升？若每瓶濃縮汁為 800 mL，至少需購買幾瓶（注意進位方式）？</w:t>
+        <w:t>【高階思維拓展：演算法設計】班級籌備 30 人的聯歡會，需調配『果汁:清水 = 1:4』的混合飲品共 15 公升（15,000 mL）。請設計分步演算法計算：濃縮果汁與清水各需多少毫升？若每瓶濃縮汁為 800 mL，至少需購買幾瓶（注意進位方式）？</w:t>
       </w:r>
     </w:p>
     <w:p>
@@ -1905,7 +1905,7 @@
                 <w:sz w:val="15"/>
                 <w:rFonts w:ascii="微軟正黑體" w:hAnsi="微軟正黑體" w:eastAsia="微軟正黑體"/>
               </w:rPr>
-              <w:t>② CER 學術論證與反駁深度</w:t>
+              <w:t>② 思維小法庭論證深度</w:t>
               <w:br/>
               <w:t>★ ★ ★ (邏輯嚴密/有論據/待加強)</w:t>
             </w:r>
@@ -1936,7 +1936,7 @@
                 <w:sz w:val="15"/>
                 <w:rFonts w:ascii="微軟正黑體" w:hAnsi="微軟正黑體" w:eastAsia="微軟正黑體"/>
               </w:rPr>
-              <w:t>③ PISA 情境題與拓展創新</w:t>
+              <w:t>③ 真實生活情境拓展創新</w:t>
               <w:br/>
               <w:t>★ ★ ★ (突破完成/掌握基礎/需輔導)</w:t>
             </w:r>

</xml_diff>